<commit_message>
Cyrillic fonts, email/Telegram contacts instead of the form, CV update
- Montserrat latin + cyrillic subsets (@fontsource, OFL) and Lora for
  Russian italics via unicode-range; RU page no longer uses system fonts
- Stylesheet inlined into the pages; Lighthouse mobile 98-100 on EN/RU
- Contact form and Telegram bot service removed: contacts are email
  (copy / write), Telegram @Buzumurga_m and LinkedIn; Nginx configs,
  audit script and server guide cleaned up accordingly
- Junior Business Analyst dates per LinkedIn (Dec 2017 - Dec 2018)
- CV: new photo, LinkedIn dates and durations, refreshed key skills

Co-Authored-By: Claude Opus 5.5 <noreply@anthropic.com>
Claude-Session: https://claude.ai/code/session_01JGqxTpeP8wSoZu71sGjLMT
</commit_message>
<xml_diff>
--- a/cv/Buzumurga_Mikhail.docx
+++ b/cv/Buzumurga_Mikhail.docx
@@ -1284,9 +1284,9 @@
                 <w:szCs w:val="24"/>
               </w:rPr>
               <w:lastRenderedPageBreak/>
-              <w:t xml:space="preserve">November 2017 - December 2018</w:t>
+              <w:t xml:space="preserve">December 2017 - December 2018</w:t>
               <w:br/>
-              <w:t xml:space="preserve">1 year 2 months</w:t>
+              <w:t xml:space="preserve">1 year 1 month</w:t>
             </w:r>
           </w:p>
         </w:tc>
@@ -1501,9 +1501,9 @@
                 <w:sz w:val="16"/>
                 <w:szCs w:val="24"/>
               </w:rPr>
-              <w:t xml:space="preserve">September 2016 - October 2017</w:t>
+              <w:t xml:space="preserve">September 2016 - November 2017</w:t>
               <w:br/>
-              <w:t xml:space="preserve">1 year 2 months</w:t>
+              <w:t xml:space="preserve">1 year 3 months</w:t>
             </w:r>
           </w:p>
         </w:tc>
@@ -2487,16 +2487,16 @@
                 <w:shd w:val="clear" w:color="E6E6E6" w:fill="E6E6E6"/>
                 <w:lang w:val="en-US"/>
               </w:rPr>
-              <w:t>CMS Wordpress</w:t>
-            </w:r>
-            <w:r>
-              <w:rPr>
-                <w:rFonts w:ascii="Arial" w:hAnsi="Arial" w:cs="Arial"/>
-                <w:sz w:val="18"/>
-                <w:szCs w:val="24"/>
-                <w:lang w:val="en-US"/>
-              </w:rPr>
-              <w:t xml:space="preserve"> </w:t>
+              <w:t>Adobe Commerce / Magento</w:t>
+            </w:r>
+            <w:r>
+              <w:rPr>
+                <w:rFonts w:ascii="Arial" w:hAnsi="Arial" w:cs="Arial"/>
+                <w:sz w:val="18"/>
+                <w:szCs w:val="24"/>
+                <w:lang w:val="en-US"/>
+              </w:rPr>
+              <w:t xml:space="preserve">  </w:t>
             </w:r>
             <w:r>
               <w:rPr>
@@ -2506,6 +2506,139 @@
                 <w:shd w:val="clear" w:color="E6E6E6" w:fill="E6E6E6"/>
                 <w:lang w:val="en-US"/>
               </w:rPr>
+              <w:t>OMS integrations</w:t>
+            </w:r>
+            <w:r>
+              <w:rPr>
+                <w:rFonts w:ascii="Arial" w:hAnsi="Arial" w:cs="Arial"/>
+                <w:sz w:val="18"/>
+                <w:szCs w:val="24"/>
+                <w:lang w:val="en-US"/>
+              </w:rPr>
+              <w:t xml:space="preserve">  </w:t>
+            </w:r>
+            <w:r>
+              <w:rPr>
+                <w:rFonts w:ascii="Arial" w:hAnsi="Arial" w:cs="Arial"/>
+                <w:sz w:val="18"/>
+                <w:szCs w:val="24"/>
+                <w:shd w:val="clear" w:color="E6E6E6" w:fill="E6E6E6"/>
+                <w:lang w:val="en-US"/>
+              </w:rPr>
+              <w:t>WordPress</w:t>
+            </w:r>
+            <w:r>
+              <w:rPr>
+                <w:rFonts w:ascii="Arial" w:hAnsi="Arial" w:cs="Arial"/>
+                <w:sz w:val="18"/>
+                <w:szCs w:val="24"/>
+                <w:lang w:val="en-US"/>
+              </w:rPr>
+              <w:t xml:space="preserve">  </w:t>
+            </w:r>
+            <w:r>
+              <w:rPr>
+                <w:rFonts w:ascii="Arial" w:hAnsi="Arial" w:cs="Arial"/>
+                <w:sz w:val="18"/>
+                <w:szCs w:val="24"/>
+                <w:shd w:val="clear" w:color="E6E6E6" w:fill="E6E6E6"/>
+                <w:lang w:val="en-US"/>
+              </w:rPr>
+              <w:t>CRM</w:t>
+            </w:r>
+            <w:r>
+              <w:rPr>
+                <w:rFonts w:ascii="Arial" w:hAnsi="Arial" w:cs="Arial"/>
+                <w:sz w:val="18"/>
+                <w:szCs w:val="24"/>
+                <w:lang w:val="en-US"/>
+              </w:rPr>
+              <w:t xml:space="preserve">  </w:t>
+            </w:r>
+            <w:r>
+              <w:rPr>
+                <w:rFonts w:ascii="Arial" w:hAnsi="Arial" w:cs="Arial"/>
+                <w:sz w:val="18"/>
+                <w:szCs w:val="24"/>
+                <w:shd w:val="clear" w:color="E6E6E6" w:fill="E6E6E6"/>
+                <w:lang w:val="en-US"/>
+              </w:rPr>
+              <w:t>Paid media (programmatic, Meta)</w:t>
+            </w:r>
+            <w:r>
+              <w:rPr>
+                <w:rFonts w:ascii="Arial" w:hAnsi="Arial" w:cs="Arial"/>
+                <w:sz w:val="18"/>
+                <w:szCs w:val="24"/>
+                <w:lang w:val="en-US"/>
+              </w:rPr>
+              <w:t xml:space="preserve">  </w:t>
+            </w:r>
+            <w:r>
+              <w:rPr>
+                <w:rFonts w:ascii="Arial" w:hAnsi="Arial" w:cs="Arial"/>
+                <w:sz w:val="18"/>
+                <w:szCs w:val="24"/>
+                <w:shd w:val="clear" w:color="E6E6E6" w:fill="E6E6E6"/>
+                <w:lang w:val="en-US"/>
+              </w:rPr>
+              <w:t>SEO</w:t>
+            </w:r>
+            <w:r>
+              <w:rPr>
+                <w:rFonts w:ascii="Arial" w:hAnsi="Arial" w:cs="Arial"/>
+                <w:sz w:val="18"/>
+                <w:szCs w:val="24"/>
+                <w:lang w:val="en-US"/>
+              </w:rPr>
+              <w:t xml:space="preserve">  </w:t>
+            </w:r>
+            <w:r>
+              <w:rPr>
+                <w:rFonts w:ascii="Arial" w:hAnsi="Arial" w:cs="Arial"/>
+                <w:sz w:val="18"/>
+                <w:szCs w:val="24"/>
+                <w:shd w:val="clear" w:color="E6E6E6" w:fill="E6E6E6"/>
+                <w:lang w:val="en-US"/>
+              </w:rPr>
+              <w:t>GEO / AI visibility</w:t>
+            </w:r>
+            <w:r>
+              <w:rPr>
+                <w:rFonts w:ascii="Arial" w:hAnsi="Arial" w:cs="Arial"/>
+                <w:sz w:val="18"/>
+                <w:szCs w:val="24"/>
+                <w:lang w:val="en-US"/>
+              </w:rPr>
+              <w:t xml:space="preserve">  </w:t>
+            </w:r>
+            <w:r>
+              <w:rPr>
+                <w:rFonts w:ascii="Arial" w:hAnsi="Arial" w:cs="Arial"/>
+                <w:sz w:val="18"/>
+                <w:szCs w:val="24"/>
+                <w:shd w:val="clear" w:color="E6E6E6" w:fill="E6E6E6"/>
+                <w:lang w:val="en-US"/>
+              </w:rPr>
+              <w:t>UX</w:t>
+            </w:r>
+            <w:r>
+              <w:rPr>
+                <w:rFonts w:ascii="Arial" w:hAnsi="Arial" w:cs="Arial"/>
+                <w:sz w:val="18"/>
+                <w:szCs w:val="24"/>
+                <w:lang w:val="en-US"/>
+              </w:rPr>
+              <w:t xml:space="preserve">  </w:t>
+            </w:r>
+            <w:r>
+              <w:rPr>
+                <w:rFonts w:ascii="Arial" w:hAnsi="Arial" w:cs="Arial"/>
+                <w:sz w:val="18"/>
+                <w:szCs w:val="24"/>
+                <w:shd w:val="clear" w:color="E6E6E6" w:fill="E6E6E6"/>
+                <w:lang w:val="en-US"/>
+              </w:rPr>
               <w:t>Google Analytics</w:t>
             </w:r>
             <w:r>
@@ -2523,8 +2656,18 @@
                 <w:sz w:val="18"/>
                 <w:szCs w:val="24"/>
                 <w:shd w:val="clear" w:color="E6E6E6" w:fill="E6E6E6"/>
-              </w:rPr>
-              <w:t>Яндекс</w:t>
+                <w:lang w:val="en-US"/>
+              </w:rPr>
+              <w:t>Yandex Metrica</w:t>
+            </w:r>
+            <w:r>
+              <w:rPr>
+                <w:rFonts w:ascii="Arial" w:hAnsi="Arial" w:cs="Arial"/>
+                <w:sz w:val="18"/>
+                <w:szCs w:val="24"/>
+                <w:lang w:val="en-US"/>
+              </w:rPr>
+              <w:t xml:space="preserve">  </w:t>
             </w:r>
             <w:r>
               <w:rPr>
@@ -2534,7 +2677,16 @@
                 <w:shd w:val="clear" w:color="E6E6E6" w:fill="E6E6E6"/>
                 <w:lang w:val="en-US"/>
               </w:rPr>
-              <w:t>.</w:t>
+              <w:t>Power BI</w:t>
+            </w:r>
+            <w:r>
+              <w:rPr>
+                <w:rFonts w:ascii="Arial" w:hAnsi="Arial" w:cs="Arial"/>
+                <w:sz w:val="18"/>
+                <w:szCs w:val="24"/>
+                <w:lang w:val="en-US"/>
+              </w:rPr>
+              <w:t xml:space="preserve">  </w:t>
             </w:r>
             <w:r>
               <w:rPr>
@@ -2542,8 +2694,9 @@
                 <w:sz w:val="18"/>
                 <w:szCs w:val="24"/>
                 <w:shd w:val="clear" w:color="E6E6E6" w:fill="E6E6E6"/>
-              </w:rPr>
-              <w:t>Метрика</w:t>
+                <w:lang w:val="en-US"/>
+              </w:rPr>
+              <w:t>Project management</w:t>
             </w:r>
             <w:r>
               <w:rPr>
@@ -2562,6 +2715,82 @@
                 <w:shd w:val="clear" w:color="E6E6E6" w:fill="E6E6E6"/>
                 <w:lang w:val="en-US"/>
               </w:rPr>
+              <w:t>Agile</w:t>
+            </w:r>
+            <w:r>
+              <w:rPr>
+                <w:rFonts w:ascii="Arial" w:hAnsi="Arial" w:cs="Arial"/>
+                <w:sz w:val="18"/>
+                <w:szCs w:val="24"/>
+                <w:lang w:val="en-US"/>
+              </w:rPr>
+              <w:t xml:space="preserve">  </w:t>
+            </w:r>
+            <w:r>
+              <w:rPr>
+                <w:rFonts w:ascii="Arial" w:hAnsi="Arial" w:cs="Arial"/>
+                <w:sz w:val="18"/>
+                <w:szCs w:val="24"/>
+                <w:shd w:val="clear" w:color="E6E6E6" w:fill="E6E6E6"/>
+                <w:lang w:val="en-US"/>
+              </w:rPr>
+              <w:t>Jira</w:t>
+            </w:r>
+            <w:r>
+              <w:rPr>
+                <w:rFonts w:ascii="Arial" w:hAnsi="Arial" w:cs="Arial"/>
+                <w:sz w:val="18"/>
+                <w:szCs w:val="24"/>
+                <w:lang w:val="en-US"/>
+              </w:rPr>
+              <w:t xml:space="preserve">  </w:t>
+            </w:r>
+            <w:r>
+              <w:rPr>
+                <w:rFonts w:ascii="Arial" w:hAnsi="Arial" w:cs="Arial"/>
+                <w:sz w:val="18"/>
+                <w:szCs w:val="24"/>
+                <w:shd w:val="clear" w:color="E6E6E6" w:fill="E6E6E6"/>
+                <w:lang w:val="en-US"/>
+              </w:rPr>
+              <w:t>GitLab</w:t>
+            </w:r>
+            <w:r>
+              <w:rPr>
+                <w:rFonts w:ascii="Arial" w:hAnsi="Arial" w:cs="Arial"/>
+                <w:sz w:val="18"/>
+                <w:szCs w:val="24"/>
+                <w:lang w:val="en-US"/>
+              </w:rPr>
+              <w:t xml:space="preserve">  </w:t>
+            </w:r>
+            <w:r>
+              <w:rPr>
+                <w:rFonts w:ascii="Arial" w:hAnsi="Arial" w:cs="Arial"/>
+                <w:sz w:val="18"/>
+                <w:szCs w:val="24"/>
+                <w:shd w:val="clear" w:color="E6E6E6" w:fill="E6E6E6"/>
+                <w:lang w:val="en-US"/>
+              </w:rPr>
+              <w:t>Jenkins</w:t>
+            </w:r>
+            <w:r>
+              <w:rPr>
+                <w:rFonts w:ascii="Arial" w:hAnsi="Arial" w:cs="Arial"/>
+                <w:sz w:val="18"/>
+                <w:szCs w:val="24"/>
+                <w:lang w:val="en-US"/>
+              </w:rPr>
+              <w:t xml:space="preserve">  </w:t>
+            </w:r>
+            <w:r>
+              <w:rPr>
+                <w:rFonts w:ascii="Arial" w:hAnsi="Arial" w:cs="Arial"/>
+                <w:sz w:val="18"/>
+                <w:szCs w:val="24"/>
+                <w:shd w:val="clear" w:color="E6E6E6" w:fill="E6E6E6"/>
+                <w:lang w:val="en-US"/>
+              </w:rPr>
               <w:t>PHP</w:t>
             </w:r>
             <w:r>
@@ -2581,7 +2810,7 @@
                 <w:shd w:val="clear" w:color="E6E6E6" w:fill="E6E6E6"/>
                 <w:lang w:val="en-US"/>
               </w:rPr>
-              <w:t>HTML5</w:t>
+              <w:t>HTML/CSS</w:t>
             </w:r>
             <w:r>
               <w:rPr>
@@ -2600,7 +2829,7 @@
                 <w:shd w:val="clear" w:color="E6E6E6" w:fill="E6E6E6"/>
                 <w:lang w:val="en-US"/>
               </w:rPr>
-              <w:t>CSS3</w:t>
+              <w:t>SQL</w:t>
             </w:r>
             <w:r>
               <w:rPr>
@@ -2619,216 +2848,7 @@
                 <w:shd w:val="clear" w:color="E6E6E6" w:fill="E6E6E6"/>
                 <w:lang w:val="en-US"/>
               </w:rPr>
-              <w:t>Jenkins</w:t>
-            </w:r>
-            <w:r>
-              <w:rPr>
-                <w:rFonts w:ascii="Arial" w:hAnsi="Arial" w:cs="Arial"/>
-                <w:sz w:val="18"/>
-                <w:szCs w:val="24"/>
-                <w:lang w:val="en-US"/>
-              </w:rPr>
-              <w:t xml:space="preserve">  </w:t>
-            </w:r>
-            <w:r>
-              <w:rPr>
-                <w:rFonts w:ascii="Arial" w:hAnsi="Arial" w:cs="Arial"/>
-                <w:sz w:val="18"/>
-                <w:szCs w:val="24"/>
-                <w:shd w:val="clear" w:color="E6E6E6" w:fill="E6E6E6"/>
-                <w:lang w:val="en-US"/>
-              </w:rPr>
               <w:t>C#</w:t>
-            </w:r>
-            <w:r>
-              <w:rPr>
-                <w:rFonts w:ascii="Arial" w:hAnsi="Arial" w:cs="Arial"/>
-                <w:sz w:val="18"/>
-                <w:szCs w:val="24"/>
-                <w:lang w:val="en-US"/>
-              </w:rPr>
-              <w:t xml:space="preserve">  </w:t>
-            </w:r>
-            <w:r>
-              <w:rPr>
-                <w:rFonts w:ascii="Arial" w:hAnsi="Arial" w:cs="Arial"/>
-                <w:sz w:val="18"/>
-                <w:szCs w:val="24"/>
-                <w:shd w:val="clear" w:color="E6E6E6" w:fill="E6E6E6"/>
-                <w:lang w:val="en-US"/>
-              </w:rPr>
-              <w:t>Project management</w:t>
-            </w:r>
-            <w:r>
-              <w:rPr>
-                <w:rFonts w:ascii="Arial" w:hAnsi="Arial" w:cs="Arial"/>
-                <w:sz w:val="18"/>
-                <w:szCs w:val="24"/>
-                <w:lang w:val="en-US"/>
-              </w:rPr>
-              <w:t xml:space="preserve">  </w:t>
-            </w:r>
-            <w:r>
-              <w:rPr>
-                <w:rFonts w:ascii="Arial" w:hAnsi="Arial" w:cs="Arial"/>
-                <w:sz w:val="18"/>
-                <w:szCs w:val="24"/>
-                <w:shd w:val="clear" w:color="E6E6E6" w:fill="E6E6E6"/>
-                <w:lang w:val="en-US"/>
-              </w:rPr>
-              <w:t>Yandex Direct</w:t>
-            </w:r>
-            <w:r>
-              <w:rPr>
-                <w:rFonts w:ascii="Arial" w:hAnsi="Arial" w:cs="Arial"/>
-                <w:sz w:val="18"/>
-                <w:szCs w:val="24"/>
-                <w:lang w:val="en-US"/>
-              </w:rPr>
-              <w:t xml:space="preserve">  </w:t>
-            </w:r>
-            <w:r>
-              <w:rPr>
-                <w:rFonts w:ascii="Arial" w:hAnsi="Arial" w:cs="Arial"/>
-                <w:sz w:val="18"/>
-                <w:szCs w:val="24"/>
-                <w:shd w:val="clear" w:color="E6E6E6" w:fill="E6E6E6"/>
-                <w:lang w:val="en-US"/>
-              </w:rPr>
-              <w:t>Google AdWords</w:t>
-            </w:r>
-            <w:r>
-              <w:rPr>
-                <w:rFonts w:ascii="Arial" w:hAnsi="Arial" w:cs="Arial"/>
-                <w:sz w:val="18"/>
-                <w:szCs w:val="24"/>
-                <w:lang w:val="en-US"/>
-              </w:rPr>
-              <w:t xml:space="preserve">  </w:t>
-            </w:r>
-            <w:r>
-              <w:rPr>
-                <w:rFonts w:ascii="Arial" w:hAnsi="Arial" w:cs="Arial"/>
-                <w:sz w:val="18"/>
-                <w:szCs w:val="24"/>
-                <w:shd w:val="clear" w:color="E6E6E6" w:fill="E6E6E6"/>
-                <w:lang w:val="en-US"/>
-              </w:rPr>
-              <w:t>Drupal</w:t>
-            </w:r>
-            <w:r>
-              <w:rPr>
-                <w:rFonts w:ascii="Arial" w:hAnsi="Arial" w:cs="Arial"/>
-                <w:sz w:val="18"/>
-                <w:szCs w:val="24"/>
-                <w:lang w:val="en-US"/>
-              </w:rPr>
-              <w:t xml:space="preserve">  </w:t>
-            </w:r>
-            <w:r>
-              <w:rPr>
-                <w:rFonts w:ascii="Arial" w:hAnsi="Arial" w:cs="Arial"/>
-                <w:sz w:val="18"/>
-                <w:szCs w:val="24"/>
-                <w:shd w:val="clear" w:color="E6E6E6" w:fill="E6E6E6"/>
-                <w:lang w:val="en-US"/>
-              </w:rPr>
-              <w:t>SEO</w:t>
-            </w:r>
-            <w:r>
-              <w:rPr>
-                <w:rFonts w:ascii="Arial" w:hAnsi="Arial" w:cs="Arial"/>
-                <w:sz w:val="18"/>
-                <w:szCs w:val="24"/>
-                <w:lang w:val="en-US"/>
-              </w:rPr>
-              <w:t xml:space="preserve">  </w:t>
-            </w:r>
-            <w:r>
-              <w:rPr>
-                <w:rFonts w:ascii="Arial" w:hAnsi="Arial" w:cs="Arial"/>
-                <w:sz w:val="18"/>
-                <w:szCs w:val="24"/>
-                <w:shd w:val="clear" w:color="E6E6E6" w:fill="E6E6E6"/>
-                <w:lang w:val="en-US"/>
-              </w:rPr>
-              <w:t>Jira</w:t>
-            </w:r>
-            <w:r>
-              <w:rPr>
-                <w:rFonts w:ascii="Arial" w:hAnsi="Arial" w:cs="Arial"/>
-                <w:sz w:val="18"/>
-                <w:szCs w:val="24"/>
-                <w:lang w:val="en-US"/>
-              </w:rPr>
-              <w:t xml:space="preserve">  </w:t>
-            </w:r>
-            <w:r>
-              <w:rPr>
-                <w:rFonts w:ascii="Arial" w:hAnsi="Arial" w:cs="Arial"/>
-                <w:sz w:val="18"/>
-                <w:szCs w:val="24"/>
-                <w:shd w:val="clear" w:color="E6E6E6" w:fill="E6E6E6"/>
-                <w:lang w:val="en-US"/>
-              </w:rPr>
-              <w:t>PowerBI</w:t>
-            </w:r>
-            <w:r>
-              <w:rPr>
-                <w:rFonts w:ascii="Arial" w:hAnsi="Arial" w:cs="Arial"/>
-                <w:sz w:val="18"/>
-                <w:szCs w:val="24"/>
-                <w:lang w:val="en-US"/>
-              </w:rPr>
-              <w:t xml:space="preserve">  </w:t>
-            </w:r>
-            <w:r>
-              <w:rPr>
-                <w:rFonts w:ascii="Arial" w:hAnsi="Arial" w:cs="Arial"/>
-                <w:sz w:val="18"/>
-                <w:szCs w:val="24"/>
-                <w:shd w:val="clear" w:color="E6E6E6" w:fill="E6E6E6"/>
-                <w:lang w:val="en-US"/>
-              </w:rPr>
-              <w:t>WebDev</w:t>
-            </w:r>
-            <w:r>
-              <w:rPr>
-                <w:rFonts w:ascii="Arial" w:hAnsi="Arial" w:cs="Arial"/>
-                <w:sz w:val="18"/>
-                <w:szCs w:val="24"/>
-                <w:lang w:val="en-US"/>
-              </w:rPr>
-              <w:t xml:space="preserve">  </w:t>
-            </w:r>
-            <w:r>
-              <w:rPr>
-                <w:rFonts w:ascii="Arial" w:hAnsi="Arial" w:cs="Arial"/>
-                <w:sz w:val="18"/>
-                <w:szCs w:val="24"/>
-                <w:shd w:val="clear" w:color="E6E6E6" w:fill="E6E6E6"/>
-                <w:lang w:val="en-US"/>
-              </w:rPr>
-              <w:t>CRM</w:t>
-            </w:r>
-            <w:r>
-              <w:rPr>
-                <w:rFonts w:ascii="Arial" w:hAnsi="Arial" w:cs="Arial"/>
-                <w:sz w:val="18"/>
-                <w:szCs w:val="24"/>
-                <w:lang w:val="en-US"/>
-              </w:rPr>
-              <w:t xml:space="preserve"> </w:t>
-            </w:r>
-            <w:r>
-              <w:rPr>
-                <w:rFonts w:ascii="Arial" w:hAnsi="Arial" w:cs="Arial"/>
-                <w:sz w:val="18"/>
-                <w:szCs w:val="24"/>
-                <w:shd w:val="clear" w:color="E6E6E6" w:fill="E6E6E6"/>
-                <w:lang w:val="en-US"/>
-              </w:rPr>
-              <w:t>UX</w:t>
             </w:r>
           </w:p>
         </w:tc>

</xml_diff>

<commit_message>
CV: JTI section in line with the Ploom case study
- Launch on the planned date with Accenture, JTI global and local IT
- Partner selection and contracts (HyperPay, Tabby, Swftbox)
- OMS designed from scratch, Arabic version of the store
- Own initiatives listed separately from the global Ploom Club and
  Refer a Friend programmes; post-purchase survey removed
- Skills: OMS design & integrations, partner selection & contracts
- Hyphen instead of an en dash in the Trainee line

Co-Authored-By: Claude Opus 5.5 <noreply@anthropic.com>
Claude-Session: https://claude.ai/code/session_01L9RhHkNRkqP5xfJjMb4Ysh
</commit_message>
<xml_diff>
--- a/cv/Buzumurga_Mikhail.docx
+++ b/cv/Buzumurga_Mikhail.docx
@@ -454,7 +454,7 @@
                 <w:szCs w:val="24"/>
                 <w:lang w:val="en-US"/>
               </w:rPr>
-              <w:t xml:space="preserve">- Business owner of the ploom.ae D2C store launch (project May 2024 - Oct 2025): requirements, Adobe Commerce (Magento) platform, OMS and delivery integrations, configuration and content. Delivered on time together with global agency and engineering partners.</w:t>
+              <w:t xml:space="preserve">- Business owner of the ploom.ae D2C store launch (project May 2024 - Oct 2025): requirements, Adobe Commerce (Magento) platform, integrations, configuration and content. Launched on the planned date with no delays, together with Accenture, JTI global and local IT and partner developers.</w:t>
             </w:r>
           </w:p>
           <w:p>
@@ -474,6 +474,46 @@
                 <w:szCs w:val="24"/>
                 <w:lang w:val="en-US"/>
               </w:rPr>
+              <w:t xml:space="preserve">- Found and selected local partners and negotiated contracts for payments (HyperPay), buy-now-pay-later (Tabby) and delivery (Swftbox).</w:t>
+            </w:r>
+          </w:p>
+          <w:p>
+            <w:pPr>
+              <w:spacing w:before="60" w:after="60" w:line="260" w:lineRule="atLeast"/>
+              <w:rPr>
+                <w:rFonts w:ascii="Arial" w:hAnsi="Arial" w:cs="Arial"/>
+                <w:sz w:val="18"/>
+                <w:szCs w:val="24"/>
+                <w:lang w:val="en-US"/>
+              </w:rPr>
+            </w:pPr>
+            <w:r>
+              <w:rPr>
+                <w:rFonts w:ascii="Arial" w:hAnsi="Arial" w:cs="Arial"/>
+                <w:sz w:val="18"/>
+                <w:szCs w:val="24"/>
+                <w:lang w:val="en-US"/>
+              </w:rPr>
+              <w:t xml:space="preserve">- Designed the order management system (OMS) from scratch with a developer: order flow, screens, reports and functions; ran the translation of the whole store into Arabic.</w:t>
+            </w:r>
+          </w:p>
+          <w:p>
+            <w:pPr>
+              <w:spacing w:before="60" w:after="60" w:line="260" w:lineRule="atLeast"/>
+              <w:rPr>
+                <w:rFonts w:ascii="Arial" w:hAnsi="Arial" w:cs="Arial"/>
+                <w:sz w:val="18"/>
+                <w:szCs w:val="24"/>
+                <w:lang w:val="en-US"/>
+              </w:rPr>
+            </w:pPr>
+            <w:r>
+              <w:rPr>
+                <w:rFonts w:ascii="Arial" w:hAnsi="Arial" w:cs="Arial"/>
+                <w:sz w:val="18"/>
+                <w:szCs w:val="24"/>
+                <w:lang w:val="en-US"/>
+              </w:rPr>
               <w:t xml:space="preserve">- Run the store end to end with a lean two-person team: trading, CRM, UX and operations.</w:t>
             </w:r>
           </w:p>
@@ -494,7 +534,7 @@
                 <w:szCs w:val="24"/>
                 <w:lang w:val="en-US"/>
               </w:rPr>
-              <w:t xml:space="preserve">- Built retention mechanics: Ploom Club loyalty, Refer a Friend, post-purchase survey, abandoned-cart recovery via email, SMS and WhatsApp.</w:t>
+              <w:t xml:space="preserve">- Proposed and launched abandoned-cart recovery via email, SMS and WhatsApp with promo codes, Tabby instalments, order-status emails from the OMS, custom OMS reports by order and SKU, and Google Maps listings for the brand's shop-in-shops; helped configure and test the global Ploom Club loyalty and Refer a Friend programmes.</w:t>
             </w:r>
           </w:p>
           <w:p>
@@ -1759,7 +1799,7 @@
                 <w:rFonts w:ascii="Arial" w:hAnsi="Arial" w:cs="Arial"/>
                 <w:lang w:val="en-US"/>
               </w:rPr>
-              <w:t xml:space="preserve"> – Trainee</w:t>
+              <w:t xml:space="preserve"> - Trainee</w:t>
             </w:r>
           </w:p>
           <w:p>
@@ -2506,7 +2546,26 @@
                 <w:shd w:val="clear" w:color="E6E6E6" w:fill="E6E6E6"/>
                 <w:lang w:val="en-US"/>
               </w:rPr>
-              <w:t>OMS integrations</w:t>
+              <w:t>OMS design &amp; integrations</w:t>
+            </w:r>
+            <w:r>
+              <w:rPr>
+                <w:rFonts w:ascii="Arial" w:hAnsi="Arial" w:cs="Arial"/>
+                <w:sz w:val="18"/>
+                <w:szCs w:val="24"/>
+                <w:lang w:val="en-US"/>
+              </w:rPr>
+              <w:t xml:space="preserve">  </w:t>
+            </w:r>
+            <w:r>
+              <w:rPr>
+                <w:rFonts w:ascii="Arial" w:hAnsi="Arial" w:cs="Arial"/>
+                <w:sz w:val="18"/>
+                <w:szCs w:val="24"/>
+                <w:shd w:val="clear" w:color="E6E6E6" w:fill="E6E6E6"/>
+                <w:lang w:val="en-US"/>
+              </w:rPr>
+              <w:t>Partner selection &amp; contracts</w:t>
             </w:r>
             <w:r>
               <w:rPr>

</xml_diff>

<commit_message>
Skills: payments & BNPL, Telegram, Git, Claude Code, React
Site (EN/RU), Tools & technologies:
- eCommerce: OMS design & integrations, Payments & BNPL (HyperPay, Tabby),
  Telegram Mini Apps
- Growth: CRM channels (email, SMS, WhatsApp), paid media split into
  programmatic and Meta, Telegram Ads
- Analytics: Gumshoe (AI visibility)
- Delivery: Agile, Git / GitHub
- "Code" becomes "Code & AI" with Claude Code and React

CV key skills: Payments & BNPL, Telegram Mini Apps, Git / GitHub, React,
Claude Code. Nothing else in the CV changes.

Co-Authored-By: Claude Opus 5.5 <noreply@anthropic.com>
Claude-Session: https://claude.ai/code/session_01L9RhHkNRkqP5xfJjMb4Ysh
</commit_message>
<xml_diff>
--- a/cv/Buzumurga_Mikhail.docx
+++ b/cv/Buzumurga_Mikhail.docx
@@ -2584,6 +2584,25 @@
                 <w:shd w:val="clear" w:color="E6E6E6" w:fill="E6E6E6"/>
                 <w:lang w:val="en-US"/>
               </w:rPr>
+              <w:t>Payments &amp; BNPL</w:t>
+            </w:r>
+            <w:r>
+              <w:rPr>
+                <w:rFonts w:ascii="Arial" w:hAnsi="Arial" w:cs="Arial"/>
+                <w:sz w:val="18"/>
+                <w:szCs w:val="24"/>
+                <w:lang w:val="en-US"/>
+              </w:rPr>
+              <w:t xml:space="preserve">  </w:t>
+            </w:r>
+            <w:r>
+              <w:rPr>
+                <w:rFonts w:ascii="Arial" w:hAnsi="Arial" w:cs="Arial"/>
+                <w:sz w:val="18"/>
+                <w:szCs w:val="24"/>
+                <w:shd w:val="clear" w:color="E6E6E6" w:fill="E6E6E6"/>
+                <w:lang w:val="en-US"/>
+              </w:rPr>
               <w:t>WordPress</w:t>
             </w:r>
             <w:r>
@@ -2603,6 +2622,25 @@
                 <w:shd w:val="clear" w:color="E6E6E6" w:fill="E6E6E6"/>
                 <w:lang w:val="en-US"/>
               </w:rPr>
+              <w:t>Telegram Mini Apps</w:t>
+            </w:r>
+            <w:r>
+              <w:rPr>
+                <w:rFonts w:ascii="Arial" w:hAnsi="Arial" w:cs="Arial"/>
+                <w:sz w:val="18"/>
+                <w:szCs w:val="24"/>
+                <w:lang w:val="en-US"/>
+              </w:rPr>
+              <w:t xml:space="preserve">  </w:t>
+            </w:r>
+            <w:r>
+              <w:rPr>
+                <w:rFonts w:ascii="Arial" w:hAnsi="Arial" w:cs="Arial"/>
+                <w:sz w:val="18"/>
+                <w:szCs w:val="24"/>
+                <w:shd w:val="clear" w:color="E6E6E6" w:fill="E6E6E6"/>
+                <w:lang w:val="en-US"/>
+              </w:rPr>
               <w:t>CRM</w:t>
             </w:r>
             <w:r>
@@ -2812,6 +2850,25 @@
                 <w:shd w:val="clear" w:color="E6E6E6" w:fill="E6E6E6"/>
                 <w:lang w:val="en-US"/>
               </w:rPr>
+              <w:t>Git / GitHub</w:t>
+            </w:r>
+            <w:r>
+              <w:rPr>
+                <w:rFonts w:ascii="Arial" w:hAnsi="Arial" w:cs="Arial"/>
+                <w:sz w:val="18"/>
+                <w:szCs w:val="24"/>
+                <w:lang w:val="en-US"/>
+              </w:rPr>
+              <w:t xml:space="preserve">  </w:t>
+            </w:r>
+            <w:r>
+              <w:rPr>
+                <w:rFonts w:ascii="Arial" w:hAnsi="Arial" w:cs="Arial"/>
+                <w:sz w:val="18"/>
+                <w:szCs w:val="24"/>
+                <w:shd w:val="clear" w:color="E6E6E6" w:fill="E6E6E6"/>
+                <w:lang w:val="en-US"/>
+              </w:rPr>
               <w:t>GitLab</w:t>
             </w:r>
             <w:r>
@@ -2908,6 +2965,44 @@
                 <w:lang w:val="en-US"/>
               </w:rPr>
               <w:t>C#</w:t>
+            </w:r>
+            <w:r>
+              <w:rPr>
+                <w:rFonts w:ascii="Arial" w:hAnsi="Arial" w:cs="Arial"/>
+                <w:sz w:val="18"/>
+                <w:szCs w:val="24"/>
+                <w:lang w:val="en-US"/>
+              </w:rPr>
+              <w:t xml:space="preserve">  </w:t>
+            </w:r>
+            <w:r>
+              <w:rPr>
+                <w:rFonts w:ascii="Arial" w:hAnsi="Arial" w:cs="Arial"/>
+                <w:sz w:val="18"/>
+                <w:szCs w:val="24"/>
+                <w:shd w:val="clear" w:color="E6E6E6" w:fill="E6E6E6"/>
+                <w:lang w:val="en-US"/>
+              </w:rPr>
+              <w:t>React</w:t>
+            </w:r>
+            <w:r>
+              <w:rPr>
+                <w:rFonts w:ascii="Arial" w:hAnsi="Arial" w:cs="Arial"/>
+                <w:sz w:val="18"/>
+                <w:szCs w:val="24"/>
+                <w:lang w:val="en-US"/>
+              </w:rPr>
+              <w:t xml:space="preserve">  </w:t>
+            </w:r>
+            <w:r>
+              <w:rPr>
+                <w:rFonts w:ascii="Arial" w:hAnsi="Arial" w:cs="Arial"/>
+                <w:sz w:val="18"/>
+                <w:szCs w:val="24"/>
+                <w:shd w:val="clear" w:color="E6E6E6" w:fill="E6E6E6"/>
+                <w:lang w:val="en-US"/>
+              </w:rPr>
+              <w:t>Claude Code</w:t>
             </w:r>
           </w:p>
         </w:tc>

</xml_diff>